<commit_message>
Add advanced analytics suite: DAG/network visualization, sensitivity, ablation, ML benchmarking, and manuscript journal assets
</commit_message>
<xml_diff>
--- a/manuscript/submission_package/targets/ijco/Final_Audit_Log.docx
+++ b/manuscript/submission_package/targets/ijco/Final_Audit_Log.docx
@@ -34,6 +34,11 @@
     <w:p>
       <w:r>
         <w:t>- Generated supplementary appendix with full benchmark/hub/perturbation tables.</w:t>
+      </w:r>
+    </w:p>
+    <w:p>
+      <w:r>
+        <w:t>- Added advanced analytics assets: PCA, advanced ML, ablation, DAG pathway summary, and sensitivity curves.</w:t>
       </w:r>
     </w:p>
     <w:p>

</xml_diff>

<commit_message>
Expand manuscript narrative for broader readability and refresh DOCX assets
</commit_message>
<xml_diff>
--- a/manuscript/submission_package/targets/ijco/Final_Audit_Log.docx
+++ b/manuscript/submission_package/targets/ijco/Final_Audit_Log.docx
@@ -13,12 +13,12 @@
     </w:p>
     <w:p>
       <w:r>
-        <w:t>- Checked figure availability and embedding order (Fig 1-9).</w:t>
+        <w:t>- Checked figure availability and embedding order (Fig 1-14).</w:t>
       </w:r>
     </w:p>
     <w:p>
       <w:r>
-        <w:t>- Checked table citations and insertion order (Table 1-7).</w:t>
+        <w:t>- Checked table citations and insertion order (Table 1-13 across main/supplementary).</w:t>
       </w:r>
     </w:p>
     <w:p>

</xml_diff>